<commit_message>
Clean files for report
</commit_message>
<xml_diff>
--- a/docs/Report/Adopted Programming Language.docx
+++ b/docs/Report/Adopted Programming Language.docx
@@ -1,6 +1,6 @@
 
 <file path=word/document.xml><?xml version="1.0" encoding="utf-8"?>
-<w:document xmlns:wpc="http://schemas.microsoft.com/office/word/2010/wordprocessingCanvas" xmlns:cx="http://schemas.microsoft.com/office/drawing/2014/chartex" xmlns:cx1="http://schemas.microsoft.com/office/drawing/2015/9/8/chartex" xmlns:cx2="http://schemas.microsoft.com/office/drawing/2015/10/21/chartex" xmlns:cx3="http://schemas.microsoft.com/office/drawing/2016/5/9/chartex" xmlns:cx4="http://schemas.microsoft.com/office/drawing/2016/5/10/chartex" xmlns:cx5="http://schemas.microsoft.com/office/drawing/2016/5/11/chartex" xmlns:cx6="http://schemas.microsoft.com/office/drawing/2016/5/12/chartex" xmlns:cx7="http://schemas.microsoft.com/office/drawing/2016/5/13/chartex" xmlns:cx8="http://schemas.microsoft.com/office/drawing/2016/5/14/chartex" xmlns:mc="http://schemas.openxmlformats.org/markup-compatibility/2006" xmlns:aink="http://schemas.microsoft.com/office/drawing/2016/ink" xmlns:am3d="http://schemas.microsoft.com/office/drawing/2017/model3d" xmlns:o="urn:schemas-microsoft-com:office:office" xmlns:oel="http://schemas.microsoft.com/office/2019/extlst" xmlns:r="http://schemas.openxmlformats.org/officeDocument/2006/relationships" xmlns:m="http://schemas.openxmlformats.org/officeDocument/2006/math" xmlns:v="urn:schemas-microsoft-com:vml" xmlns:wp14="http://schemas.microsoft.com/office/word/2010/wordprocessingDrawing" xmlns:wp="http://schemas.openxmlformats.org/drawingml/2006/wordprocessingDrawing" xmlns:w10="urn:schemas-microsoft-com:office:word" xmlns:w="http://schemas.openxmlformats.org/wordprocessingml/2006/main" xmlns:w14="http://schemas.microsoft.com/office/word/2010/wordml" xmlns:w15="http://schemas.microsoft.com/office/word/2012/wordml" xmlns:w16cex="http://schemas.microsoft.com/office/word/2018/wordml/cex" xmlns:w16cid="http://schemas.microsoft.com/office/word/2016/wordml/cid" xmlns:w16="http://schemas.microsoft.com/office/word/2018/wordml" xmlns:w16du="http://schemas.microsoft.com/office/word/2023/wordml/word16du" xmlns:w16sdtdh="http://schemas.microsoft.com/office/word/2020/wordml/sdtdatahash" xmlns:w16sdtfl="http://schemas.microsoft.com/office/word/2024/wordml/sdtformatlock" xmlns:w16se="http://schemas.microsoft.com/office/word/2015/wordml/symex" xmlns:wpg="http://schemas.microsoft.com/office/word/2010/wordprocessingGroup" xmlns:wpi="http://schemas.microsoft.com/office/word/2010/wordprocessingInk" xmlns:wne="http://schemas.microsoft.com/office/word/2006/wordml" xmlns:wps="http://schemas.microsoft.com/office/word/2010/wordprocessingShape" mc:Ignorable="w14 w15 w16se w16cid w16 w16cex w16sdtdh w16sdtfl w16du wp14">
+<w:document xmlns:wpc="http://schemas.microsoft.com/office/word/2010/wordprocessingCanvas" xmlns:cx="http://schemas.microsoft.com/office/drawing/2014/chartex" xmlns:cx1="http://schemas.microsoft.com/office/drawing/2015/9/8/chartex" xmlns:cx2="http://schemas.microsoft.com/office/drawing/2015/10/21/chartex" xmlns:cx3="http://schemas.microsoft.com/office/drawing/2016/5/9/chartex" xmlns:cx4="http://schemas.microsoft.com/office/drawing/2016/5/10/chartex" xmlns:cx5="http://schemas.microsoft.com/office/drawing/2016/5/11/chartex" xmlns:cx6="http://schemas.microsoft.com/office/drawing/2016/5/12/chartex" xmlns:cx7="http://schemas.microsoft.com/office/drawing/2016/5/13/chartex" xmlns:cx8="http://schemas.microsoft.com/office/drawing/2016/5/14/chartex" xmlns:mc="http://schemas.openxmlformats.org/markup-compatibility/2006" xmlns:aink="http://schemas.microsoft.com/office/drawing/2016/ink" xmlns:am3d="http://schemas.microsoft.com/office/drawing/2017/model3d" xmlns:o="urn:schemas-microsoft-com:office:office" xmlns:oel="http://schemas.microsoft.com/office/2019/extlst" xmlns:r="http://schemas.openxmlformats.org/officeDocument/2006/relationships" xmlns:m="http://schemas.openxmlformats.org/officeDocument/2006/math" xmlns:v="urn:schemas-microsoft-com:vml" xmlns:wp14="http://schemas.microsoft.com/office/word/2010/wordprocessingDrawing" xmlns:wp="http://schemas.openxmlformats.org/drawingml/2006/wordprocessingDrawing" xmlns:w10="urn:schemas-microsoft-com:office:word" xmlns:w="http://schemas.openxmlformats.org/wordprocessingml/2006/main" xmlns:w14="http://schemas.microsoft.com/office/word/2010/wordml" xmlns:w15="http://schemas.microsoft.com/office/word/2012/wordml" xmlns:w16cex="http://schemas.microsoft.com/office/word/2018/wordml/cex" xmlns:w16cid="http://schemas.microsoft.com/office/word/2016/wordml/cid" xmlns:w16="http://schemas.microsoft.com/office/word/2018/wordml" xmlns:w16du="http://schemas.microsoft.com/office/word/2023/wordml/word16du" xmlns:w16sdtdh="http://schemas.microsoft.com/office/word/2020/wordml/sdtdatahash" xmlns:w16se="http://schemas.microsoft.com/office/word/2015/wordml/symex" xmlns:wpg="http://schemas.microsoft.com/office/word/2010/wordprocessingGroup" xmlns:wpi="http://schemas.microsoft.com/office/word/2010/wordprocessingInk" xmlns:wne="http://schemas.microsoft.com/office/word/2006/wordml" xmlns:wps="http://schemas.microsoft.com/office/word/2010/wordprocessingShape" mc:Ignorable="w14 w15 w16se w16cid w16 w16cex w16sdtdh wp14">
   <w:body>
     <w:p>
       <w:pPr>
@@ -17,71 +17,56 @@
     </w:p>
     <w:p>
       <w:pPr>
-        <w:jc w:val="both"/>
-        <w:rPr>
-          <w:rFonts w:cstheme="minorHAnsi"/>
-          <w:sz w:val="28"/>
-          <w:szCs w:val="32"/>
-        </w:rPr>
-      </w:pPr>
-      <w:r>
-        <w:rPr>
-          <w:rFonts w:cstheme="minorHAnsi"/>
-          <w:sz w:val="28"/>
-          <w:szCs w:val="32"/>
-        </w:rPr>
-        <w:t>The system is implemented using the following languages and technologies, each chosen for a specific reason:</w:t>
+        <w:jc w:val="center"/>
+        <w:rPr>
+          <w:i/>
+          <w:iCs/>
+        </w:rPr>
+      </w:pPr>
+      <w:r>
+        <w:rPr>
+          <w:i/>
+          <w:iCs/>
+        </w:rPr>
+        <w:t>The system is implemented using the following languages and technologies</w:t>
+      </w:r>
+      <w:r>
+        <w:rPr>
+          <w:i/>
+          <w:iCs/>
+        </w:rPr>
+        <w:t>.</w:t>
       </w:r>
     </w:p>
     <w:tbl>
       <w:tblPr>
+        <w:tblStyle w:val="GridTable2-Accent5"/>
         <w:tblW w:w="8409" w:type="dxa"/>
-        <w:tblBorders>
-          <w:top w:val="single" w:sz="4" w:space="0" w:color="auto"/>
-          <w:left w:val="single" w:sz="4" w:space="0" w:color="auto"/>
-          <w:bottom w:val="single" w:sz="4" w:space="0" w:color="auto"/>
-          <w:right w:val="single" w:sz="4" w:space="0" w:color="auto"/>
-          <w:insideH w:val="single" w:sz="4" w:space="0" w:color="auto"/>
-          <w:insideV w:val="single" w:sz="4" w:space="0" w:color="auto"/>
-        </w:tblBorders>
-        <w:tblCellMar>
-          <w:top w:w="15" w:type="dxa"/>
-          <w:left w:w="15" w:type="dxa"/>
-          <w:bottom w:w="15" w:type="dxa"/>
-          <w:right w:w="15" w:type="dxa"/>
-        </w:tblCellMar>
         <w:tblLook w:val="04A0" w:firstRow="1" w:lastRow="0" w:firstColumn="1" w:lastColumn="0" w:noHBand="0" w:noVBand="1"/>
       </w:tblPr>
       <w:tblGrid>
-        <w:gridCol w:w="1764"/>
-        <w:gridCol w:w="3032"/>
-        <w:gridCol w:w="3613"/>
+        <w:gridCol w:w="1864"/>
+        <w:gridCol w:w="3003"/>
+        <w:gridCol w:w="3542"/>
       </w:tblGrid>
       <w:tr>
         <w:trPr>
+          <w:cnfStyle w:val="100000000000" w:firstRow="1" w:lastRow="0" w:firstColumn="0" w:lastColumn="0" w:oddVBand="0" w:evenVBand="0" w:oddHBand="0" w:evenHBand="0" w:firstRowFirstColumn="0" w:firstRowLastColumn="0" w:lastRowFirstColumn="0" w:lastRowLastColumn="0"/>
           <w:trHeight w:val="287"/>
-          <w:tblHeader/>
         </w:trPr>
         <w:tc>
           <w:tcPr>
+            <w:cnfStyle w:val="001000000000" w:firstRow="0" w:lastRow="0" w:firstColumn="1" w:lastColumn="0" w:oddVBand="0" w:evenVBand="0" w:oddHBand="0" w:evenHBand="0" w:firstRowFirstColumn="0" w:firstRowLastColumn="0" w:lastRowFirstColumn="0" w:lastRowLastColumn="0"/>
             <w:tcW w:w="0" w:type="auto"/>
-            <w:tcMar>
-              <w:top w:w="15" w:type="dxa"/>
-              <w:left w:w="15" w:type="dxa"/>
-              <w:bottom w:w="160" w:type="dxa"/>
-              <w:right w:w="15" w:type="dxa"/>
-            </w:tcMar>
-            <w:vAlign w:val="bottom"/>
             <w:hideMark/>
           </w:tcPr>
           <w:p>
             <w:pPr>
-              <w:spacing w:after="0"/>
               <w:jc w:val="center"/>
               <w:rPr>
                 <w:rFonts w:cstheme="minorHAnsi"/>
-                <w:b/>
-                <w:bCs/>
+                <w:b w:val="0"/>
+                <w:bCs w:val="0"/>
                 <w:sz w:val="28"/>
                 <w:szCs w:val="32"/>
               </w:rPr>
@@ -89,8 +74,6 @@
             <w:r>
               <w:rPr>
                 <w:rFonts w:cstheme="minorHAnsi"/>
-                <w:b/>
-                <w:bCs/>
                 <w:sz w:val="28"/>
                 <w:szCs w:val="32"/>
               </w:rPr>
@@ -101,23 +84,16 @@
         <w:tc>
           <w:tcPr>
             <w:tcW w:w="0" w:type="auto"/>
-            <w:tcMar>
-              <w:top w:w="15" w:type="dxa"/>
-              <w:left w:w="15" w:type="dxa"/>
-              <w:bottom w:w="160" w:type="dxa"/>
-              <w:right w:w="15" w:type="dxa"/>
-            </w:tcMar>
-            <w:vAlign w:val="bottom"/>
             <w:hideMark/>
           </w:tcPr>
           <w:p>
             <w:pPr>
-              <w:spacing w:after="0"/>
               <w:jc w:val="center"/>
-              <w:rPr>
-                <w:rFonts w:cstheme="minorHAnsi"/>
-                <w:b/>
-                <w:bCs/>
+              <w:cnfStyle w:val="100000000000" w:firstRow="1" w:lastRow="0" w:firstColumn="0" w:lastColumn="0" w:oddVBand="0" w:evenVBand="0" w:oddHBand="0" w:evenHBand="0" w:firstRowFirstColumn="0" w:firstRowLastColumn="0" w:lastRowFirstColumn="0" w:lastRowLastColumn="0"/>
+              <w:rPr>
+                <w:rFonts w:cstheme="minorHAnsi"/>
+                <w:b w:val="0"/>
+                <w:bCs w:val="0"/>
                 <w:sz w:val="28"/>
                 <w:szCs w:val="32"/>
               </w:rPr>
@@ -125,8 +101,6 @@
             <w:r>
               <w:rPr>
                 <w:rFonts w:cstheme="minorHAnsi"/>
-                <w:b/>
-                <w:bCs/>
                 <w:sz w:val="28"/>
                 <w:szCs w:val="32"/>
               </w:rPr>
@@ -137,23 +111,16 @@
         <w:tc>
           <w:tcPr>
             <w:tcW w:w="0" w:type="auto"/>
-            <w:tcMar>
-              <w:top w:w="15" w:type="dxa"/>
-              <w:left w:w="15" w:type="dxa"/>
-              <w:bottom w:w="160" w:type="dxa"/>
-              <w:right w:w="15" w:type="dxa"/>
-            </w:tcMar>
-            <w:vAlign w:val="bottom"/>
             <w:hideMark/>
           </w:tcPr>
           <w:p>
             <w:pPr>
-              <w:spacing w:after="0"/>
               <w:jc w:val="center"/>
-              <w:rPr>
-                <w:rFonts w:cstheme="minorHAnsi"/>
-                <w:b/>
-                <w:bCs/>
+              <w:cnfStyle w:val="100000000000" w:firstRow="1" w:lastRow="0" w:firstColumn="0" w:lastColumn="0" w:oddVBand="0" w:evenVBand="0" w:oddHBand="0" w:evenHBand="0" w:firstRowFirstColumn="0" w:firstRowLastColumn="0" w:lastRowFirstColumn="0" w:lastRowLastColumn="0"/>
+              <w:rPr>
+                <w:rFonts w:cstheme="minorHAnsi"/>
+                <w:b w:val="0"/>
+                <w:bCs w:val="0"/>
                 <w:sz w:val="28"/>
                 <w:szCs w:val="32"/>
               </w:rPr>
@@ -161,8 +128,6 @@
             <w:r>
               <w:rPr>
                 <w:rFonts w:cstheme="minorHAnsi"/>
-                <w:b/>
-                <w:bCs/>
                 <w:sz w:val="28"/>
                 <w:szCs w:val="32"/>
               </w:rPr>
@@ -173,23 +138,17 @@
       </w:tr>
       <w:tr>
         <w:trPr>
+          <w:cnfStyle w:val="000000100000" w:firstRow="0" w:lastRow="0" w:firstColumn="0" w:lastColumn="0" w:oddVBand="0" w:evenVBand="0" w:oddHBand="1" w:evenHBand="0" w:firstRowFirstColumn="0" w:firstRowLastColumn="0" w:lastRowFirstColumn="0" w:lastRowLastColumn="0"/>
           <w:trHeight w:val="287"/>
         </w:trPr>
         <w:tc>
           <w:tcPr>
+            <w:cnfStyle w:val="001000000000" w:firstRow="0" w:lastRow="0" w:firstColumn="1" w:lastColumn="0" w:oddVBand="0" w:evenVBand="0" w:oddHBand="0" w:evenHBand="0" w:firstRowFirstColumn="0" w:firstRowLastColumn="0" w:lastRowFirstColumn="0" w:lastRowLastColumn="0"/>
             <w:tcW w:w="0" w:type="auto"/>
-            <w:tcMar>
-              <w:top w:w="160" w:type="dxa"/>
-              <w:left w:w="15" w:type="dxa"/>
-              <w:bottom w:w="160" w:type="dxa"/>
-              <w:right w:w="15" w:type="dxa"/>
-            </w:tcMar>
-            <w:vAlign w:val="bottom"/>
             <w:hideMark/>
           </w:tcPr>
           <w:p>
             <w:pPr>
-              <w:spacing w:after="0"/>
               <w:jc w:val="center"/>
               <w:rPr>
                 <w:rFonts w:cstheme="minorHAnsi"/>
@@ -210,19 +169,12 @@
         <w:tc>
           <w:tcPr>
             <w:tcW w:w="0" w:type="auto"/>
-            <w:tcMar>
-              <w:top w:w="160" w:type="dxa"/>
-              <w:left w:w="15" w:type="dxa"/>
-              <w:bottom w:w="160" w:type="dxa"/>
-              <w:right w:w="15" w:type="dxa"/>
-            </w:tcMar>
-            <w:vAlign w:val="bottom"/>
             <w:hideMark/>
           </w:tcPr>
           <w:p>
             <w:pPr>
-              <w:spacing w:after="0"/>
               <w:jc w:val="center"/>
+              <w:cnfStyle w:val="000000100000" w:firstRow="0" w:lastRow="0" w:firstColumn="0" w:lastColumn="0" w:oddVBand="0" w:evenVBand="0" w:oddHBand="1" w:evenHBand="0" w:firstRowFirstColumn="0" w:firstRowLastColumn="0" w:lastRowFirstColumn="0" w:lastRowLastColumn="0"/>
               <w:rPr>
                 <w:rFonts w:cstheme="minorHAnsi"/>
                 <w:sz w:val="28"/>
@@ -242,19 +194,12 @@
         <w:tc>
           <w:tcPr>
             <w:tcW w:w="0" w:type="auto"/>
-            <w:tcMar>
-              <w:top w:w="160" w:type="dxa"/>
-              <w:left w:w="15" w:type="dxa"/>
-              <w:bottom w:w="160" w:type="dxa"/>
-              <w:right w:w="15" w:type="dxa"/>
-            </w:tcMar>
-            <w:vAlign w:val="bottom"/>
             <w:hideMark/>
           </w:tcPr>
           <w:p>
             <w:pPr>
-              <w:spacing w:after="0"/>
               <w:jc w:val="center"/>
+              <w:cnfStyle w:val="000000100000" w:firstRow="0" w:lastRow="0" w:firstColumn="0" w:lastColumn="0" w:oddVBand="0" w:evenVBand="0" w:oddHBand="1" w:evenHBand="0" w:firstRowFirstColumn="0" w:firstRowLastColumn="0" w:lastRowFirstColumn="0" w:lastRowLastColumn="0"/>
               <w:rPr>
                 <w:rFonts w:cstheme="minorHAnsi"/>
                 <w:sz w:val="28"/>
@@ -278,19 +223,12 @@
         </w:trPr>
         <w:tc>
           <w:tcPr>
+            <w:cnfStyle w:val="001000000000" w:firstRow="0" w:lastRow="0" w:firstColumn="1" w:lastColumn="0" w:oddVBand="0" w:evenVBand="0" w:oddHBand="0" w:evenHBand="0" w:firstRowFirstColumn="0" w:firstRowLastColumn="0" w:lastRowFirstColumn="0" w:lastRowLastColumn="0"/>
             <w:tcW w:w="0" w:type="auto"/>
-            <w:tcMar>
-              <w:top w:w="160" w:type="dxa"/>
-              <w:left w:w="15" w:type="dxa"/>
-              <w:bottom w:w="160" w:type="dxa"/>
-              <w:right w:w="15" w:type="dxa"/>
-            </w:tcMar>
-            <w:vAlign w:val="bottom"/>
             <w:hideMark/>
           </w:tcPr>
           <w:p>
             <w:pPr>
-              <w:spacing w:after="0"/>
               <w:jc w:val="center"/>
               <w:rPr>
                 <w:rFonts w:cstheme="minorHAnsi"/>
@@ -311,19 +249,12 @@
         <w:tc>
           <w:tcPr>
             <w:tcW w:w="0" w:type="auto"/>
-            <w:tcMar>
-              <w:top w:w="160" w:type="dxa"/>
-              <w:left w:w="15" w:type="dxa"/>
-              <w:bottom w:w="160" w:type="dxa"/>
-              <w:right w:w="15" w:type="dxa"/>
-            </w:tcMar>
-            <w:vAlign w:val="bottom"/>
             <w:hideMark/>
           </w:tcPr>
           <w:p>
             <w:pPr>
-              <w:spacing w:after="0"/>
               <w:jc w:val="center"/>
+              <w:cnfStyle w:val="000000000000" w:firstRow="0" w:lastRow="0" w:firstColumn="0" w:lastColumn="0" w:oddVBand="0" w:evenVBand="0" w:oddHBand="0" w:evenHBand="0" w:firstRowFirstColumn="0" w:firstRowLastColumn="0" w:lastRowFirstColumn="0" w:lastRowLastColumn="0"/>
               <w:rPr>
                 <w:rFonts w:cstheme="minorHAnsi"/>
                 <w:sz w:val="28"/>
@@ -343,19 +274,12 @@
         <w:tc>
           <w:tcPr>
             <w:tcW w:w="0" w:type="auto"/>
-            <w:tcMar>
-              <w:top w:w="160" w:type="dxa"/>
-              <w:left w:w="15" w:type="dxa"/>
-              <w:bottom w:w="160" w:type="dxa"/>
-              <w:right w:w="15" w:type="dxa"/>
-            </w:tcMar>
-            <w:vAlign w:val="bottom"/>
             <w:hideMark/>
           </w:tcPr>
           <w:p>
             <w:pPr>
-              <w:spacing w:after="0"/>
               <w:jc w:val="center"/>
+              <w:cnfStyle w:val="000000000000" w:firstRow="0" w:lastRow="0" w:firstColumn="0" w:lastColumn="0" w:oddVBand="0" w:evenVBand="0" w:oddHBand="0" w:evenHBand="0" w:firstRowFirstColumn="0" w:firstRowLastColumn="0" w:lastRowFirstColumn="0" w:lastRowLastColumn="0"/>
               <w:rPr>
                 <w:rFonts w:cstheme="minorHAnsi"/>
                 <w:sz w:val="28"/>
@@ -375,23 +299,17 @@
       </w:tr>
       <w:tr>
         <w:trPr>
+          <w:cnfStyle w:val="000000100000" w:firstRow="0" w:lastRow="0" w:firstColumn="0" w:lastColumn="0" w:oddVBand="0" w:evenVBand="0" w:oddHBand="1" w:evenHBand="0" w:firstRowFirstColumn="0" w:firstRowLastColumn="0" w:lastRowFirstColumn="0" w:lastRowLastColumn="0"/>
           <w:trHeight w:val="294"/>
         </w:trPr>
         <w:tc>
           <w:tcPr>
+            <w:cnfStyle w:val="001000000000" w:firstRow="0" w:lastRow="0" w:firstColumn="1" w:lastColumn="0" w:oddVBand="0" w:evenVBand="0" w:oddHBand="0" w:evenHBand="0" w:firstRowFirstColumn="0" w:firstRowLastColumn="0" w:lastRowFirstColumn="0" w:lastRowLastColumn="0"/>
             <w:tcW w:w="0" w:type="auto"/>
-            <w:tcMar>
-              <w:top w:w="160" w:type="dxa"/>
-              <w:left w:w="15" w:type="dxa"/>
-              <w:bottom w:w="160" w:type="dxa"/>
-              <w:right w:w="15" w:type="dxa"/>
-            </w:tcMar>
-            <w:vAlign w:val="bottom"/>
             <w:hideMark/>
           </w:tcPr>
           <w:p>
             <w:pPr>
-              <w:spacing w:after="0"/>
               <w:jc w:val="center"/>
               <w:rPr>
                 <w:rFonts w:cstheme="minorHAnsi"/>
@@ -412,19 +330,12 @@
         <w:tc>
           <w:tcPr>
             <w:tcW w:w="0" w:type="auto"/>
-            <w:tcMar>
-              <w:top w:w="160" w:type="dxa"/>
-              <w:left w:w="15" w:type="dxa"/>
-              <w:bottom w:w="160" w:type="dxa"/>
-              <w:right w:w="15" w:type="dxa"/>
-            </w:tcMar>
-            <w:vAlign w:val="bottom"/>
             <w:hideMark/>
           </w:tcPr>
           <w:p>
             <w:pPr>
-              <w:spacing w:after="0"/>
               <w:jc w:val="center"/>
+              <w:cnfStyle w:val="000000100000" w:firstRow="0" w:lastRow="0" w:firstColumn="0" w:lastColumn="0" w:oddVBand="0" w:evenVBand="0" w:oddHBand="1" w:evenHBand="0" w:firstRowFirstColumn="0" w:firstRowLastColumn="0" w:lastRowFirstColumn="0" w:lastRowLastColumn="0"/>
               <w:rPr>
                 <w:rFonts w:cstheme="minorHAnsi"/>
                 <w:sz w:val="28"/>
@@ -444,19 +355,12 @@
         <w:tc>
           <w:tcPr>
             <w:tcW w:w="0" w:type="auto"/>
-            <w:tcMar>
-              <w:top w:w="160" w:type="dxa"/>
-              <w:left w:w="15" w:type="dxa"/>
-              <w:bottom w:w="160" w:type="dxa"/>
-              <w:right w:w="15" w:type="dxa"/>
-            </w:tcMar>
-            <w:vAlign w:val="bottom"/>
             <w:hideMark/>
           </w:tcPr>
           <w:p>
             <w:pPr>
-              <w:spacing w:after="0"/>
               <w:jc w:val="center"/>
+              <w:cnfStyle w:val="000000100000" w:firstRow="0" w:lastRow="0" w:firstColumn="0" w:lastColumn="0" w:oddVBand="0" w:evenVBand="0" w:oddHBand="1" w:evenHBand="0" w:firstRowFirstColumn="0" w:firstRowLastColumn="0" w:lastRowFirstColumn="0" w:lastRowLastColumn="0"/>
               <w:rPr>
                 <w:rFonts w:cstheme="minorHAnsi"/>
                 <w:sz w:val="28"/>
@@ -480,19 +384,12 @@
         </w:trPr>
         <w:tc>
           <w:tcPr>
+            <w:cnfStyle w:val="001000000000" w:firstRow="0" w:lastRow="0" w:firstColumn="1" w:lastColumn="0" w:oddVBand="0" w:evenVBand="0" w:oddHBand="0" w:evenHBand="0" w:firstRowFirstColumn="0" w:firstRowLastColumn="0" w:lastRowFirstColumn="0" w:lastRowLastColumn="0"/>
             <w:tcW w:w="0" w:type="auto"/>
-            <w:tcMar>
-              <w:top w:w="160" w:type="dxa"/>
-              <w:left w:w="15" w:type="dxa"/>
-              <w:bottom w:w="160" w:type="dxa"/>
-              <w:right w:w="15" w:type="dxa"/>
-            </w:tcMar>
-            <w:vAlign w:val="bottom"/>
             <w:hideMark/>
           </w:tcPr>
           <w:p>
             <w:pPr>
-              <w:spacing w:after="0"/>
               <w:jc w:val="center"/>
               <w:rPr>
                 <w:rFonts w:cstheme="minorHAnsi"/>
@@ -513,19 +410,12 @@
         <w:tc>
           <w:tcPr>
             <w:tcW w:w="0" w:type="auto"/>
-            <w:tcMar>
-              <w:top w:w="160" w:type="dxa"/>
-              <w:left w:w="15" w:type="dxa"/>
-              <w:bottom w:w="160" w:type="dxa"/>
-              <w:right w:w="15" w:type="dxa"/>
-            </w:tcMar>
-            <w:vAlign w:val="bottom"/>
             <w:hideMark/>
           </w:tcPr>
           <w:p>
             <w:pPr>
-              <w:spacing w:after="0"/>
               <w:jc w:val="center"/>
+              <w:cnfStyle w:val="000000000000" w:firstRow="0" w:lastRow="0" w:firstColumn="0" w:lastColumn="0" w:oddVBand="0" w:evenVBand="0" w:oddHBand="0" w:evenHBand="0" w:firstRowFirstColumn="0" w:firstRowLastColumn="0" w:lastRowFirstColumn="0" w:lastRowLastColumn="0"/>
               <w:rPr>
                 <w:rFonts w:cstheme="minorHAnsi"/>
                 <w:sz w:val="28"/>
@@ -545,19 +435,12 @@
         <w:tc>
           <w:tcPr>
             <w:tcW w:w="0" w:type="auto"/>
-            <w:tcMar>
-              <w:top w:w="160" w:type="dxa"/>
-              <w:left w:w="15" w:type="dxa"/>
-              <w:bottom w:w="160" w:type="dxa"/>
-              <w:right w:w="15" w:type="dxa"/>
-            </w:tcMar>
-            <w:vAlign w:val="bottom"/>
             <w:hideMark/>
           </w:tcPr>
           <w:p>
             <w:pPr>
-              <w:spacing w:after="0"/>
               <w:jc w:val="center"/>
+              <w:cnfStyle w:val="000000000000" w:firstRow="0" w:lastRow="0" w:firstColumn="0" w:lastColumn="0" w:oddVBand="0" w:evenVBand="0" w:oddHBand="0" w:evenHBand="0" w:firstRowFirstColumn="0" w:firstRowLastColumn="0" w:lastRowFirstColumn="0" w:lastRowLastColumn="0"/>
               <w:rPr>
                 <w:rFonts w:cstheme="minorHAnsi"/>
                 <w:sz w:val="28"/>
@@ -577,23 +460,17 @@
       </w:tr>
       <w:tr>
         <w:trPr>
+          <w:cnfStyle w:val="000000100000" w:firstRow="0" w:lastRow="0" w:firstColumn="0" w:lastColumn="0" w:oddVBand="0" w:evenVBand="0" w:oddHBand="1" w:evenHBand="0" w:firstRowFirstColumn="0" w:firstRowLastColumn="0" w:lastRowFirstColumn="0" w:lastRowLastColumn="0"/>
           <w:trHeight w:val="287"/>
         </w:trPr>
         <w:tc>
           <w:tcPr>
+            <w:cnfStyle w:val="001000000000" w:firstRow="0" w:lastRow="0" w:firstColumn="1" w:lastColumn="0" w:oddVBand="0" w:evenVBand="0" w:oddHBand="0" w:evenHBand="0" w:firstRowFirstColumn="0" w:firstRowLastColumn="0" w:lastRowFirstColumn="0" w:lastRowLastColumn="0"/>
             <w:tcW w:w="0" w:type="auto"/>
-            <w:tcMar>
-              <w:top w:w="160" w:type="dxa"/>
-              <w:left w:w="15" w:type="dxa"/>
-              <w:bottom w:w="160" w:type="dxa"/>
-              <w:right w:w="15" w:type="dxa"/>
-            </w:tcMar>
-            <w:vAlign w:val="bottom"/>
             <w:hideMark/>
           </w:tcPr>
           <w:p>
             <w:pPr>
-              <w:spacing w:after="0"/>
               <w:jc w:val="center"/>
               <w:rPr>
                 <w:rFonts w:cstheme="minorHAnsi"/>
@@ -614,19 +491,12 @@
         <w:tc>
           <w:tcPr>
             <w:tcW w:w="0" w:type="auto"/>
-            <w:tcMar>
-              <w:top w:w="160" w:type="dxa"/>
-              <w:left w:w="15" w:type="dxa"/>
-              <w:bottom w:w="160" w:type="dxa"/>
-              <w:right w:w="15" w:type="dxa"/>
-            </w:tcMar>
-            <w:vAlign w:val="bottom"/>
             <w:hideMark/>
           </w:tcPr>
           <w:p>
             <w:pPr>
-              <w:spacing w:after="0"/>
               <w:jc w:val="center"/>
+              <w:cnfStyle w:val="000000100000" w:firstRow="0" w:lastRow="0" w:firstColumn="0" w:lastColumn="0" w:oddVBand="0" w:evenVBand="0" w:oddHBand="1" w:evenHBand="0" w:firstRowFirstColumn="0" w:firstRowLastColumn="0" w:lastRowFirstColumn="0" w:lastRowLastColumn="0"/>
               <w:rPr>
                 <w:rFonts w:cstheme="minorHAnsi"/>
                 <w:sz w:val="28"/>
@@ -646,19 +516,12 @@
         <w:tc>
           <w:tcPr>
             <w:tcW w:w="0" w:type="auto"/>
-            <w:tcMar>
-              <w:top w:w="160" w:type="dxa"/>
-              <w:left w:w="15" w:type="dxa"/>
-              <w:bottom w:w="160" w:type="dxa"/>
-              <w:right w:w="15" w:type="dxa"/>
-            </w:tcMar>
-            <w:vAlign w:val="bottom"/>
             <w:hideMark/>
           </w:tcPr>
           <w:p>
             <w:pPr>
-              <w:spacing w:after="0"/>
               <w:jc w:val="center"/>
+              <w:cnfStyle w:val="000000100000" w:firstRow="0" w:lastRow="0" w:firstColumn="0" w:lastColumn="0" w:oddVBand="0" w:evenVBand="0" w:oddHBand="1" w:evenHBand="0" w:firstRowFirstColumn="0" w:firstRowLastColumn="0" w:lastRowFirstColumn="0" w:lastRowLastColumn="0"/>
               <w:rPr>
                 <w:rFonts w:cstheme="minorHAnsi"/>
                 <w:sz w:val="28"/>
@@ -679,21 +542,10 @@
     </w:tbl>
     <w:p>
       <w:pPr>
-        <w:numPr>
-          <w:ilvl w:val="0"/>
-          <w:numId w:val="6"/>
-        </w:numPr>
         <w:tabs>
           <w:tab w:val="num" w:pos="720"/>
         </w:tabs>
         <w:jc w:val="both"/>
-        <w:rPr>
-          <w:rFonts w:cstheme="minorHAnsi"/>
-          <w:sz w:val="28"/>
-          <w:szCs w:val="32"/>
-        </w:rPr>
-      </w:pPr>
-      <w:r>
         <w:rPr>
           <w:rFonts w:cstheme="minorHAnsi"/>
           <w:b/>
@@ -701,27 +553,14 @@
           <w:sz w:val="28"/>
           <w:szCs w:val="32"/>
         </w:rPr>
-        <w:t>Java</w:t>
-      </w:r>
-      <w:r>
-        <w:rPr>
-          <w:rFonts w:cstheme="minorHAnsi"/>
-          <w:sz w:val="28"/>
-          <w:szCs w:val="32"/>
-        </w:rPr>
-        <w:t> was selected as the primary backend language for both the Socket Server and the Bridge Server due to its native support for low-level socket programming through the java.net package, as well as its strong multi-threading capabilities that allow handling multiple concurrent client connections efficiently.</w:t>
-      </w:r>
+      </w:pPr>
     </w:p>
     <w:p>
       <w:pPr>
-        <w:numPr>
-          <w:ilvl w:val="0"/>
-          <w:numId w:val="6"/>
-        </w:numPr>
         <w:tabs>
           <w:tab w:val="num" w:pos="720"/>
         </w:tabs>
-        <w:jc w:val="both"/>
+        <w:jc w:val="lowKashida"/>
         <w:rPr>
           <w:rFonts w:cstheme="minorHAnsi"/>
           <w:sz w:val="28"/>
@@ -736,33 +575,8 @@
           <w:sz w:val="28"/>
           <w:szCs w:val="32"/>
         </w:rPr>
-        <w:t>No frameworks</w:t>
-      </w:r>
-      <w:r>
-        <w:rPr>
-          <w:rFonts w:cstheme="minorHAnsi"/>
-          <w:sz w:val="28"/>
-          <w:szCs w:val="32"/>
-        </w:rPr>
-        <w:t> are used in any core backend component, in direct compliance with the project requirement that the main application must be implemented using low-level socket communication only.</w:t>
-      </w:r>
-    </w:p>
-    <w:p>
-      <w:pPr>
-        <w:numPr>
-          <w:ilvl w:val="0"/>
-          <w:numId w:val="6"/>
-        </w:numPr>
-        <w:tabs>
-          <w:tab w:val="num" w:pos="720"/>
-        </w:tabs>
-        <w:jc w:val="both"/>
-        <w:rPr>
-          <w:rFonts w:cstheme="minorHAnsi"/>
-          <w:sz w:val="28"/>
-          <w:szCs w:val="32"/>
-        </w:rPr>
-      </w:pPr>
+        <w:tab/>
+      </w:r>
       <w:r>
         <w:rPr>
           <w:rFonts w:cstheme="minorHAnsi"/>
@@ -771,7 +585,7 @@
           <w:sz w:val="28"/>
           <w:szCs w:val="32"/>
         </w:rPr>
-        <w:t>React</w:t>
+        <w:t>Java</w:t>
       </w:r>
       <w:r>
         <w:rPr>
@@ -779,19 +593,15 @@
           <w:sz w:val="28"/>
           <w:szCs w:val="32"/>
         </w:rPr>
-        <w:t> was chosen for the frontend to deliver a dynamic and responsive user interface, enabling smooth interaction with all marketplace features across both the WebSocket and REST communication channels.</w:t>
+        <w:t> was selected as the primary backend language for both the Socket Server and the Bridge Server due to its native support for low-level socket programming through the java.net package, as well as its strong multi-threading capabilities that allow handling multiple concurrent client connections efficiently.</w:t>
       </w:r>
     </w:p>
     <w:p>
       <w:pPr>
-        <w:numPr>
-          <w:ilvl w:val="0"/>
-          <w:numId w:val="6"/>
-        </w:numPr>
         <w:tabs>
           <w:tab w:val="num" w:pos="720"/>
         </w:tabs>
-        <w:jc w:val="both"/>
+        <w:jc w:val="lowKashida"/>
         <w:rPr>
           <w:rFonts w:cstheme="minorHAnsi"/>
           <w:sz w:val="28"/>
@@ -806,33 +616,8 @@
           <w:sz w:val="28"/>
           <w:szCs w:val="32"/>
         </w:rPr>
-        <w:t>Spring Boot</w:t>
-      </w:r>
-      <w:r>
-        <w:rPr>
-          <w:rFonts w:cstheme="minorHAnsi"/>
-          <w:sz w:val="28"/>
-          <w:szCs w:val="32"/>
-        </w:rPr>
-        <w:t> was adopted exclusively for the bonus REST web service layer, where framework usage is permitted, providing a clean and efficient way to expose the three selected features as standard REST endpoints.</w:t>
-      </w:r>
-    </w:p>
-    <w:p>
-      <w:pPr>
-        <w:numPr>
-          <w:ilvl w:val="0"/>
-          <w:numId w:val="6"/>
-        </w:numPr>
-        <w:tabs>
-          <w:tab w:val="num" w:pos="720"/>
-        </w:tabs>
-        <w:jc w:val="both"/>
-        <w:rPr>
-          <w:rFonts w:cstheme="minorHAnsi"/>
-          <w:sz w:val="28"/>
-          <w:szCs w:val="32"/>
-        </w:rPr>
-      </w:pPr>
+        <w:tab/>
+      </w:r>
       <w:r>
         <w:rPr>
           <w:rFonts w:cstheme="minorHAnsi"/>
@@ -841,7 +626,7 @@
           <w:sz w:val="28"/>
           <w:szCs w:val="32"/>
         </w:rPr>
-        <w:t>CockroachDB</w:t>
+        <w:t>No frameworks</w:t>
       </w:r>
       <w:r>
         <w:rPr>
@@ -849,35 +634,177 @@
           <w:sz w:val="28"/>
           <w:szCs w:val="32"/>
         </w:rPr>
-        <w:t> was selected as the database solution, with all schemas, partitioning logic, and queries written in standard SQL, taking advantage of CockroachDB's built-in support for distributed data storage and horizontal partitioning</w:t>
+        <w:t> are used in any core backend component, in direct compliance with the project requirement that the main application must be implemented using low-level socket communication only.</w:t>
       </w:r>
     </w:p>
     <w:p>
       <w:pPr>
-        <w:jc w:val="both"/>
-        <w:sectPr>
-          <w:footerReference w:type="default" r:id="rId5"/>
-          <w:pgSz w:w="11906" w:h="16838"/>
-          <w:pgMar w:top="1440" w:right="1800" w:bottom="1440" w:left="1800" w:header="720" w:footer="720" w:gutter="0"/>
-          <w:pgBorders w:offsetFrom="page">
-            <w:top w:val="thinThickSmallGap" w:sz="24" w:space="24" w:color="auto"/>
-            <w:left w:val="thinThickSmallGap" w:sz="24" w:space="24" w:color="auto"/>
-            <w:bottom w:val="thickThinSmallGap" w:sz="24" w:space="24" w:color="auto"/>
-            <w:right w:val="thickThinSmallGap" w:sz="24" w:space="24" w:color="auto"/>
-          </w:pgBorders>
-          <w:cols w:space="720"/>
-          <w:bidi/>
-          <w:rtlGutter/>
-          <w:docGrid w:linePitch="360"/>
-        </w:sectPr>
-      </w:pPr>
+        <w:tabs>
+          <w:tab w:val="num" w:pos="720"/>
+        </w:tabs>
+        <w:jc w:val="lowKashida"/>
+        <w:rPr>
+          <w:rFonts w:cstheme="minorHAnsi"/>
+          <w:sz w:val="28"/>
+          <w:szCs w:val="32"/>
+        </w:rPr>
+      </w:pPr>
+      <w:r>
+        <w:rPr>
+          <w:rFonts w:cstheme="minorHAnsi"/>
+          <w:b/>
+          <w:bCs/>
+          <w:sz w:val="28"/>
+          <w:szCs w:val="32"/>
+        </w:rPr>
+        <w:tab/>
+      </w:r>
+      <w:r>
+        <w:rPr>
+          <w:rFonts w:cstheme="minorHAnsi"/>
+          <w:b/>
+          <w:bCs/>
+          <w:sz w:val="28"/>
+          <w:szCs w:val="32"/>
+        </w:rPr>
+        <w:t>React</w:t>
+      </w:r>
+      <w:r>
+        <w:rPr>
+          <w:rFonts w:cstheme="minorHAnsi"/>
+          <w:sz w:val="28"/>
+          <w:szCs w:val="32"/>
+        </w:rPr>
+        <w:t xml:space="preserve"> was chosen for the frontend to deliver a dynamic and responsive user interface, enabling smooth interaction with all </w:t>
+      </w:r>
+      <w:r>
+        <w:rPr>
+          <w:rFonts w:cstheme="minorHAnsi"/>
+          <w:sz w:val="28"/>
+          <w:szCs w:val="32"/>
+        </w:rPr>
+        <w:t>marketplace</w:t>
+      </w:r>
+      <w:r>
+        <w:rPr>
+          <w:rFonts w:cstheme="minorHAnsi"/>
+          <w:sz w:val="28"/>
+          <w:szCs w:val="32"/>
+        </w:rPr>
+        <w:t>’s</w:t>
+      </w:r>
+      <w:r>
+        <w:rPr>
+          <w:rFonts w:cstheme="minorHAnsi"/>
+          <w:sz w:val="28"/>
+          <w:szCs w:val="32"/>
+        </w:rPr>
+        <w:t xml:space="preserve"> features across both the WebSocket and REST communication channels.</w:t>
+      </w:r>
     </w:p>
     <w:p>
       <w:pPr>
-        <w:jc w:val="both"/>
-      </w:pPr>
+        <w:tabs>
+          <w:tab w:val="num" w:pos="720"/>
+        </w:tabs>
+        <w:jc w:val="lowKashida"/>
+        <w:rPr>
+          <w:rFonts w:cstheme="minorHAnsi"/>
+          <w:sz w:val="28"/>
+          <w:szCs w:val="32"/>
+        </w:rPr>
+      </w:pPr>
+      <w:r>
+        <w:rPr>
+          <w:rFonts w:cstheme="minorHAnsi"/>
+          <w:b/>
+          <w:bCs/>
+          <w:sz w:val="28"/>
+          <w:szCs w:val="32"/>
+        </w:rPr>
+        <w:tab/>
+      </w:r>
+      <w:r>
+        <w:rPr>
+          <w:rFonts w:cstheme="minorHAnsi"/>
+          <w:b/>
+          <w:bCs/>
+          <w:sz w:val="28"/>
+          <w:szCs w:val="32"/>
+        </w:rPr>
+        <w:t>Spring Boot</w:t>
+      </w:r>
+      <w:r>
+        <w:rPr>
+          <w:rFonts w:cstheme="minorHAnsi"/>
+          <w:sz w:val="28"/>
+          <w:szCs w:val="32"/>
+        </w:rPr>
+        <w:t> was adopted exclusively for the bonus REST web service layer, where framework usage is permitted, providing a clean and efficient way to expose the three selected features as standard REST endpoints.</w:t>
+      </w:r>
+    </w:p>
+    <w:p>
+      <w:pPr>
+        <w:tabs>
+          <w:tab w:val="num" w:pos="720"/>
+        </w:tabs>
+        <w:jc w:val="lowKashida"/>
+      </w:pPr>
+      <w:r>
+        <w:rPr>
+          <w:rFonts w:cstheme="minorHAnsi"/>
+          <w:b/>
+          <w:bCs/>
+          <w:sz w:val="28"/>
+          <w:szCs w:val="32"/>
+        </w:rPr>
+        <w:tab/>
+      </w:r>
+      <w:r>
+        <w:rPr>
+          <w:rFonts w:cstheme="minorHAnsi"/>
+          <w:b/>
+          <w:bCs/>
+          <w:sz w:val="28"/>
+          <w:szCs w:val="32"/>
+        </w:rPr>
+        <w:t>CockroachDB</w:t>
+      </w:r>
+      <w:r>
+        <w:rPr>
+          <w:rFonts w:cstheme="minorHAnsi"/>
+          <w:sz w:val="28"/>
+          <w:szCs w:val="32"/>
+        </w:rPr>
+        <w:t> was selected as the database solution, with all schemas, partitioning logic, and queries written in standard SQL, taking advantage of CockroachDB</w:t>
+      </w:r>
+      <w:r>
+        <w:rPr>
+          <w:rFonts w:cstheme="minorHAnsi"/>
+          <w:sz w:val="28"/>
+          <w:szCs w:val="32"/>
+        </w:rPr>
+        <w:t>’s</w:t>
+      </w:r>
+      <w:r>
+        <w:rPr>
+          <w:rFonts w:cstheme="minorHAnsi"/>
+          <w:sz w:val="28"/>
+          <w:szCs w:val="32"/>
+        </w:rPr>
+        <w:t xml:space="preserve"> built-in support for distributed data storage and horizontal partitioning</w:t>
+      </w:r>
+      <w:r>
+        <w:rPr>
+          <w:rFonts w:cstheme="minorHAnsi"/>
+          <w:sz w:val="28"/>
+          <w:szCs w:val="32"/>
+        </w:rPr>
+        <w:t>.</w:t>
+      </w:r>
     </w:p>
     <w:sectPr>
+      <w:footerReference w:type="default" r:id="rId7"/>
       <w:pgSz w:w="11906" w:h="16838"/>
       <w:pgMar w:top="1440" w:right="1800" w:bottom="1440" w:left="1800" w:header="720" w:footer="720" w:gutter="0"/>
       <w:pgBorders w:offsetFrom="page">
@@ -895,8 +822,33 @@
 </w:document>
 </file>
 
+<file path=word/endnotes.xml><?xml version="1.0" encoding="utf-8"?>
+<w:endnotes xmlns:wpc="http://schemas.microsoft.com/office/word/2010/wordprocessingCanvas" xmlns:cx="http://schemas.microsoft.com/office/drawing/2014/chartex" xmlns:cx1="http://schemas.microsoft.com/office/drawing/2015/9/8/chartex" xmlns:cx2="http://schemas.microsoft.com/office/drawing/2015/10/21/chartex" xmlns:cx3="http://schemas.microsoft.com/office/drawing/2016/5/9/chartex" xmlns:cx4="http://schemas.microsoft.com/office/drawing/2016/5/10/chartex" xmlns:cx5="http://schemas.microsoft.com/office/drawing/2016/5/11/chartex" xmlns:cx6="http://schemas.microsoft.com/office/drawing/2016/5/12/chartex" xmlns:cx7="http://schemas.microsoft.com/office/drawing/2016/5/13/chartex" xmlns:cx8="http://schemas.microsoft.com/office/drawing/2016/5/14/chartex" xmlns:mc="http://schemas.openxmlformats.org/markup-compatibility/2006" xmlns:aink="http://schemas.microsoft.com/office/drawing/2016/ink" xmlns:am3d="http://schemas.microsoft.com/office/drawing/2017/model3d" xmlns:o="urn:schemas-microsoft-com:office:office" xmlns:oel="http://schemas.microsoft.com/office/2019/extlst" xmlns:r="http://schemas.openxmlformats.org/officeDocument/2006/relationships" xmlns:m="http://schemas.openxmlformats.org/officeDocument/2006/math" xmlns:v="urn:schemas-microsoft-com:vml" xmlns:wp14="http://schemas.microsoft.com/office/word/2010/wordprocessingDrawing" xmlns:wp="http://schemas.openxmlformats.org/drawingml/2006/wordprocessingDrawing" xmlns:w10="urn:schemas-microsoft-com:office:word" xmlns:w="http://schemas.openxmlformats.org/wordprocessingml/2006/main" xmlns:w14="http://schemas.microsoft.com/office/word/2010/wordml" xmlns:w15="http://schemas.microsoft.com/office/word/2012/wordml" xmlns:w16cex="http://schemas.microsoft.com/office/word/2018/wordml/cex" xmlns:w16cid="http://schemas.microsoft.com/office/word/2016/wordml/cid" xmlns:w16="http://schemas.microsoft.com/office/word/2018/wordml" xmlns:w16du="http://schemas.microsoft.com/office/word/2023/wordml/word16du" xmlns:w16sdtdh="http://schemas.microsoft.com/office/word/2020/wordml/sdtdatahash" xmlns:w16se="http://schemas.microsoft.com/office/word/2015/wordml/symex" xmlns:wpg="http://schemas.microsoft.com/office/word/2010/wordprocessingGroup" xmlns:wpi="http://schemas.microsoft.com/office/word/2010/wordprocessingInk" xmlns:wne="http://schemas.microsoft.com/office/word/2006/wordml" xmlns:wps="http://schemas.microsoft.com/office/word/2010/wordprocessingShape" mc:Ignorable="w14 w15 w16se w16cid w16 w16cex w16sdtdh wp14">
+  <w:endnote w:type="separator" w:id="-1">
+    <w:p>
+      <w:pPr>
+        <w:spacing w:after="0" w:line="240" w:lineRule="auto"/>
+      </w:pPr>
+      <w:r>
+        <w:separator/>
+      </w:r>
+    </w:p>
+  </w:endnote>
+  <w:endnote w:type="continuationSeparator" w:id="0">
+    <w:p>
+      <w:pPr>
+        <w:spacing w:after="0" w:line="240" w:lineRule="auto"/>
+      </w:pPr>
+      <w:r>
+        <w:continuationSeparator/>
+      </w:r>
+    </w:p>
+  </w:endnote>
+</w:endnotes>
+</file>
+
 <file path=word/footer1.xml><?xml version="1.0" encoding="utf-8"?>
-<w:ftr xmlns:wpc="http://schemas.microsoft.com/office/word/2010/wordprocessingCanvas" xmlns:cx="http://schemas.microsoft.com/office/drawing/2014/chartex" xmlns:cx1="http://schemas.microsoft.com/office/drawing/2015/9/8/chartex" xmlns:cx2="http://schemas.microsoft.com/office/drawing/2015/10/21/chartex" xmlns:cx3="http://schemas.microsoft.com/office/drawing/2016/5/9/chartex" xmlns:cx4="http://schemas.microsoft.com/office/drawing/2016/5/10/chartex" xmlns:cx5="http://schemas.microsoft.com/office/drawing/2016/5/11/chartex" xmlns:cx6="http://schemas.microsoft.com/office/drawing/2016/5/12/chartex" xmlns:cx7="http://schemas.microsoft.com/office/drawing/2016/5/13/chartex" xmlns:cx8="http://schemas.microsoft.com/office/drawing/2016/5/14/chartex" xmlns:mc="http://schemas.openxmlformats.org/markup-compatibility/2006" xmlns:aink="http://schemas.microsoft.com/office/drawing/2016/ink" xmlns:am3d="http://schemas.microsoft.com/office/drawing/2017/model3d" xmlns:o="urn:schemas-microsoft-com:office:office" xmlns:oel="http://schemas.microsoft.com/office/2019/extlst" xmlns:r="http://schemas.openxmlformats.org/officeDocument/2006/relationships" xmlns:m="http://schemas.openxmlformats.org/officeDocument/2006/math" xmlns:v="urn:schemas-microsoft-com:vml" xmlns:wp14="http://schemas.microsoft.com/office/word/2010/wordprocessingDrawing" xmlns:wp="http://schemas.openxmlformats.org/drawingml/2006/wordprocessingDrawing" xmlns:w10="urn:schemas-microsoft-com:office:word" xmlns:w="http://schemas.openxmlformats.org/wordprocessingml/2006/main" xmlns:w14="http://schemas.microsoft.com/office/word/2010/wordml" xmlns:w15="http://schemas.microsoft.com/office/word/2012/wordml" xmlns:w16cex="http://schemas.microsoft.com/office/word/2018/wordml/cex" xmlns:w16cid="http://schemas.microsoft.com/office/word/2016/wordml/cid" xmlns:w16="http://schemas.microsoft.com/office/word/2018/wordml" xmlns:w16du="http://schemas.microsoft.com/office/word/2023/wordml/word16du" xmlns:w16sdtdh="http://schemas.microsoft.com/office/word/2020/wordml/sdtdatahash" xmlns:w16sdtfl="http://schemas.microsoft.com/office/word/2024/wordml/sdtformatlock" xmlns:w16se="http://schemas.microsoft.com/office/word/2015/wordml/symex" xmlns:wpg="http://schemas.microsoft.com/office/word/2010/wordprocessingGroup" xmlns:wpi="http://schemas.microsoft.com/office/word/2010/wordprocessingInk" xmlns:wne="http://schemas.microsoft.com/office/word/2006/wordml" xmlns:wps="http://schemas.microsoft.com/office/word/2010/wordprocessingShape" mc:Ignorable="w14 w15 w16se w16cid w16 w16cex w16sdtdh w16sdtfl w16du wp14">
+<w:ftr xmlns:wpc="http://schemas.microsoft.com/office/word/2010/wordprocessingCanvas" xmlns:cx="http://schemas.microsoft.com/office/drawing/2014/chartex" xmlns:cx1="http://schemas.microsoft.com/office/drawing/2015/9/8/chartex" xmlns:cx2="http://schemas.microsoft.com/office/drawing/2015/10/21/chartex" xmlns:cx3="http://schemas.microsoft.com/office/drawing/2016/5/9/chartex" xmlns:cx4="http://schemas.microsoft.com/office/drawing/2016/5/10/chartex" xmlns:cx5="http://schemas.microsoft.com/office/drawing/2016/5/11/chartex" xmlns:cx6="http://schemas.microsoft.com/office/drawing/2016/5/12/chartex" xmlns:cx7="http://schemas.microsoft.com/office/drawing/2016/5/13/chartex" xmlns:cx8="http://schemas.microsoft.com/office/drawing/2016/5/14/chartex" xmlns:mc="http://schemas.openxmlformats.org/markup-compatibility/2006" xmlns:aink="http://schemas.microsoft.com/office/drawing/2016/ink" xmlns:am3d="http://schemas.microsoft.com/office/drawing/2017/model3d" xmlns:o="urn:schemas-microsoft-com:office:office" xmlns:oel="http://schemas.microsoft.com/office/2019/extlst" xmlns:r="http://schemas.openxmlformats.org/officeDocument/2006/relationships" xmlns:m="http://schemas.openxmlformats.org/officeDocument/2006/math" xmlns:v="urn:schemas-microsoft-com:vml" xmlns:wp14="http://schemas.microsoft.com/office/word/2010/wordprocessingDrawing" xmlns:wp="http://schemas.openxmlformats.org/drawingml/2006/wordprocessingDrawing" xmlns:w10="urn:schemas-microsoft-com:office:word" xmlns:w="http://schemas.openxmlformats.org/wordprocessingml/2006/main" xmlns:w14="http://schemas.microsoft.com/office/word/2010/wordml" xmlns:w15="http://schemas.microsoft.com/office/word/2012/wordml" xmlns:w16cex="http://schemas.microsoft.com/office/word/2018/wordml/cex" xmlns:w16cid="http://schemas.microsoft.com/office/word/2016/wordml/cid" xmlns:w16="http://schemas.microsoft.com/office/word/2018/wordml" xmlns:w16du="http://schemas.microsoft.com/office/word/2023/wordml/word16du" xmlns:w16sdtdh="http://schemas.microsoft.com/office/word/2020/wordml/sdtdatahash" xmlns:w16se="http://schemas.microsoft.com/office/word/2015/wordml/symex" xmlns:wpg="http://schemas.microsoft.com/office/word/2010/wordprocessingGroup" xmlns:wpi="http://schemas.microsoft.com/office/word/2010/wordprocessingInk" xmlns:wne="http://schemas.microsoft.com/office/word/2006/wordml" xmlns:wps="http://schemas.microsoft.com/office/word/2010/wordprocessingShape" mc:Ignorable="w14 w15 w16se w16cid w16 w16cex w16sdtdh wp14">
   <w:sdt>
     <w:sdtPr>
       <w:id w:val="1205205134"/>
@@ -949,8 +901,33 @@
 </w:ftr>
 </file>
 
+<file path=word/footnotes.xml><?xml version="1.0" encoding="utf-8"?>
+<w:footnotes xmlns:wpc="http://schemas.microsoft.com/office/word/2010/wordprocessingCanvas" xmlns:cx="http://schemas.microsoft.com/office/drawing/2014/chartex" xmlns:cx1="http://schemas.microsoft.com/office/drawing/2015/9/8/chartex" xmlns:cx2="http://schemas.microsoft.com/office/drawing/2015/10/21/chartex" xmlns:cx3="http://schemas.microsoft.com/office/drawing/2016/5/9/chartex" xmlns:cx4="http://schemas.microsoft.com/office/drawing/2016/5/10/chartex" xmlns:cx5="http://schemas.microsoft.com/office/drawing/2016/5/11/chartex" xmlns:cx6="http://schemas.microsoft.com/office/drawing/2016/5/12/chartex" xmlns:cx7="http://schemas.microsoft.com/office/drawing/2016/5/13/chartex" xmlns:cx8="http://schemas.microsoft.com/office/drawing/2016/5/14/chartex" xmlns:mc="http://schemas.openxmlformats.org/markup-compatibility/2006" xmlns:aink="http://schemas.microsoft.com/office/drawing/2016/ink" xmlns:am3d="http://schemas.microsoft.com/office/drawing/2017/model3d" xmlns:o="urn:schemas-microsoft-com:office:office" xmlns:oel="http://schemas.microsoft.com/office/2019/extlst" xmlns:r="http://schemas.openxmlformats.org/officeDocument/2006/relationships" xmlns:m="http://schemas.openxmlformats.org/officeDocument/2006/math" xmlns:v="urn:schemas-microsoft-com:vml" xmlns:wp14="http://schemas.microsoft.com/office/word/2010/wordprocessingDrawing" xmlns:wp="http://schemas.openxmlformats.org/drawingml/2006/wordprocessingDrawing" xmlns:w10="urn:schemas-microsoft-com:office:word" xmlns:w="http://schemas.openxmlformats.org/wordprocessingml/2006/main" xmlns:w14="http://schemas.microsoft.com/office/word/2010/wordml" xmlns:w15="http://schemas.microsoft.com/office/word/2012/wordml" xmlns:w16cex="http://schemas.microsoft.com/office/word/2018/wordml/cex" xmlns:w16cid="http://schemas.microsoft.com/office/word/2016/wordml/cid" xmlns:w16="http://schemas.microsoft.com/office/word/2018/wordml" xmlns:w16du="http://schemas.microsoft.com/office/word/2023/wordml/word16du" xmlns:w16sdtdh="http://schemas.microsoft.com/office/word/2020/wordml/sdtdatahash" xmlns:w16se="http://schemas.microsoft.com/office/word/2015/wordml/symex" xmlns:wpg="http://schemas.microsoft.com/office/word/2010/wordprocessingGroup" xmlns:wpi="http://schemas.microsoft.com/office/word/2010/wordprocessingInk" xmlns:wne="http://schemas.microsoft.com/office/word/2006/wordml" xmlns:wps="http://schemas.microsoft.com/office/word/2010/wordprocessingShape" mc:Ignorable="w14 w15 w16se w16cid w16 w16cex w16sdtdh wp14">
+  <w:footnote w:type="separator" w:id="-1">
+    <w:p>
+      <w:pPr>
+        <w:spacing w:after="0" w:line="240" w:lineRule="auto"/>
+      </w:pPr>
+      <w:r>
+        <w:separator/>
+      </w:r>
+    </w:p>
+  </w:footnote>
+  <w:footnote w:type="continuationSeparator" w:id="0">
+    <w:p>
+      <w:pPr>
+        <w:spacing w:after="0" w:line="240" w:lineRule="auto"/>
+      </w:pPr>
+      <w:r>
+        <w:continuationSeparator/>
+      </w:r>
+    </w:p>
+  </w:footnote>
+</w:footnotes>
+</file>
+
 <file path=word/numbering.xml><?xml version="1.0" encoding="utf-8"?>
-<w:numbering xmlns:wpc="http://schemas.microsoft.com/office/word/2010/wordprocessingCanvas" xmlns:cx="http://schemas.microsoft.com/office/drawing/2014/chartex" xmlns:cx1="http://schemas.microsoft.com/office/drawing/2015/9/8/chartex" xmlns:cx2="http://schemas.microsoft.com/office/drawing/2015/10/21/chartex" xmlns:cx3="http://schemas.microsoft.com/office/drawing/2016/5/9/chartex" xmlns:cx4="http://schemas.microsoft.com/office/drawing/2016/5/10/chartex" xmlns:cx5="http://schemas.microsoft.com/office/drawing/2016/5/11/chartex" xmlns:cx6="http://schemas.microsoft.com/office/drawing/2016/5/12/chartex" xmlns:cx7="http://schemas.microsoft.com/office/drawing/2016/5/13/chartex" xmlns:cx8="http://schemas.microsoft.com/office/drawing/2016/5/14/chartex" xmlns:mc="http://schemas.openxmlformats.org/markup-compatibility/2006" xmlns:aink="http://schemas.microsoft.com/office/drawing/2016/ink" xmlns:am3d="http://schemas.microsoft.com/office/drawing/2017/model3d" xmlns:o="urn:schemas-microsoft-com:office:office" xmlns:oel="http://schemas.microsoft.com/office/2019/extlst" xmlns:r="http://schemas.openxmlformats.org/officeDocument/2006/relationships" xmlns:m="http://schemas.openxmlformats.org/officeDocument/2006/math" xmlns:v="urn:schemas-microsoft-com:vml" xmlns:wp14="http://schemas.microsoft.com/office/word/2010/wordprocessingDrawing" xmlns:wp="http://schemas.openxmlformats.org/drawingml/2006/wordprocessingDrawing" xmlns:w10="urn:schemas-microsoft-com:office:word" xmlns:w="http://schemas.openxmlformats.org/wordprocessingml/2006/main" xmlns:w14="http://schemas.microsoft.com/office/word/2010/wordml" xmlns:w15="http://schemas.microsoft.com/office/word/2012/wordml" xmlns:w16cex="http://schemas.microsoft.com/office/word/2018/wordml/cex" xmlns:w16cid="http://schemas.microsoft.com/office/word/2016/wordml/cid" xmlns:w16="http://schemas.microsoft.com/office/word/2018/wordml" xmlns:w16du="http://schemas.microsoft.com/office/word/2023/wordml/word16du" xmlns:w16sdtdh="http://schemas.microsoft.com/office/word/2020/wordml/sdtdatahash" xmlns:w16sdtfl="http://schemas.microsoft.com/office/word/2024/wordml/sdtformatlock" xmlns:w16se="http://schemas.microsoft.com/office/word/2015/wordml/symex" xmlns:wpg="http://schemas.microsoft.com/office/word/2010/wordprocessingGroup" xmlns:wpi="http://schemas.microsoft.com/office/word/2010/wordprocessingInk" xmlns:wne="http://schemas.microsoft.com/office/word/2006/wordml" xmlns:wps="http://schemas.microsoft.com/office/word/2010/wordprocessingShape" mc:Ignorable="w14 w15 w16se w16cid w16 w16cex w16sdtdh w16sdtfl w16du wp14">
+<w:numbering xmlns:wpc="http://schemas.microsoft.com/office/word/2010/wordprocessingCanvas" xmlns:cx="http://schemas.microsoft.com/office/drawing/2014/chartex" xmlns:cx1="http://schemas.microsoft.com/office/drawing/2015/9/8/chartex" xmlns:cx2="http://schemas.microsoft.com/office/drawing/2015/10/21/chartex" xmlns:cx3="http://schemas.microsoft.com/office/drawing/2016/5/9/chartex" xmlns:cx4="http://schemas.microsoft.com/office/drawing/2016/5/10/chartex" xmlns:cx5="http://schemas.microsoft.com/office/drawing/2016/5/11/chartex" xmlns:cx6="http://schemas.microsoft.com/office/drawing/2016/5/12/chartex" xmlns:cx7="http://schemas.microsoft.com/office/drawing/2016/5/13/chartex" xmlns:cx8="http://schemas.microsoft.com/office/drawing/2016/5/14/chartex" xmlns:mc="http://schemas.openxmlformats.org/markup-compatibility/2006" xmlns:aink="http://schemas.microsoft.com/office/drawing/2016/ink" xmlns:am3d="http://schemas.microsoft.com/office/drawing/2017/model3d" xmlns:o="urn:schemas-microsoft-com:office:office" xmlns:oel="http://schemas.microsoft.com/office/2019/extlst" xmlns:r="http://schemas.openxmlformats.org/officeDocument/2006/relationships" xmlns:m="http://schemas.openxmlformats.org/officeDocument/2006/math" xmlns:v="urn:schemas-microsoft-com:vml" xmlns:wp14="http://schemas.microsoft.com/office/word/2010/wordprocessingDrawing" xmlns:wp="http://schemas.openxmlformats.org/drawingml/2006/wordprocessingDrawing" xmlns:w10="urn:schemas-microsoft-com:office:word" xmlns:w="http://schemas.openxmlformats.org/wordprocessingml/2006/main" xmlns:w14="http://schemas.microsoft.com/office/word/2010/wordml" xmlns:w15="http://schemas.microsoft.com/office/word/2012/wordml" xmlns:w16cex="http://schemas.microsoft.com/office/word/2018/wordml/cex" xmlns:w16cid="http://schemas.microsoft.com/office/word/2016/wordml/cid" xmlns:w16="http://schemas.microsoft.com/office/word/2018/wordml" xmlns:w16du="http://schemas.microsoft.com/office/word/2023/wordml/word16du" xmlns:w16sdtdh="http://schemas.microsoft.com/office/word/2020/wordml/sdtdatahash" xmlns:w16se="http://schemas.microsoft.com/office/word/2015/wordml/symex" xmlns:wpg="http://schemas.microsoft.com/office/word/2010/wordprocessingGroup" xmlns:wpi="http://schemas.microsoft.com/office/word/2010/wordprocessingInk" xmlns:wne="http://schemas.microsoft.com/office/word/2006/wordml" xmlns:wps="http://schemas.microsoft.com/office/word/2010/wordprocessingShape" mc:Ignorable="w14 w15 w16se w16cid w16 w16cex w16sdtdh wp14">
   <w:abstractNum w:abstractNumId="0" w15:restartNumberingAfterBreak="0">
     <w:nsid w:val="07D81549"/>
     <w:multiLevelType w:val="hybridMultilevel"/>
@@ -1609,7 +1586,7 @@
 </file>
 
 <file path=word/styles.xml><?xml version="1.0" encoding="utf-8"?>
-<w:styles xmlns:mc="http://schemas.openxmlformats.org/markup-compatibility/2006" xmlns:r="http://schemas.openxmlformats.org/officeDocument/2006/relationships" xmlns:w="http://schemas.openxmlformats.org/wordprocessingml/2006/main" xmlns:w14="http://schemas.microsoft.com/office/word/2010/wordml" xmlns:w15="http://schemas.microsoft.com/office/word/2012/wordml" xmlns:w16cex="http://schemas.microsoft.com/office/word/2018/wordml/cex" xmlns:w16cid="http://schemas.microsoft.com/office/word/2016/wordml/cid" xmlns:w16="http://schemas.microsoft.com/office/word/2018/wordml" xmlns:w16du="http://schemas.microsoft.com/office/word/2023/wordml/word16du" xmlns:w16sdtdh="http://schemas.microsoft.com/office/word/2020/wordml/sdtdatahash" xmlns:w16sdtfl="http://schemas.microsoft.com/office/word/2024/wordml/sdtformatlock" xmlns:w16se="http://schemas.microsoft.com/office/word/2015/wordml/symex" mc:Ignorable="w14 w15 w16se w16cid w16 w16cex w16sdtdh w16sdtfl w16du">
+<w:styles xmlns:mc="http://schemas.openxmlformats.org/markup-compatibility/2006" xmlns:r="http://schemas.openxmlformats.org/officeDocument/2006/relationships" xmlns:w="http://schemas.openxmlformats.org/wordprocessingml/2006/main" xmlns:w14="http://schemas.microsoft.com/office/word/2010/wordml" xmlns:w15="http://schemas.microsoft.com/office/word/2012/wordml" xmlns:w16cex="http://schemas.microsoft.com/office/word/2018/wordml/cex" xmlns:w16cid="http://schemas.microsoft.com/office/word/2016/wordml/cid" xmlns:w16="http://schemas.microsoft.com/office/word/2018/wordml" xmlns:w16sdtdh="http://schemas.microsoft.com/office/word/2020/wordml/sdtdatahash" xmlns:w16se="http://schemas.microsoft.com/office/word/2015/wordml/symex" mc:Ignorable="w14 w15 w16se w16cid w16 w16cex w16sdtdh">
   <w:docDefaults>
     <w:rPrDefault>
       <w:rPr>
@@ -2230,6 +2207,217 @@
       <w:szCs w:val="28"/>
     </w:rPr>
   </w:style>
+  <w:style w:type="table" w:styleId="GridTable3-Accent5">
+    <w:name w:val="Grid Table 3 Accent 5"/>
+    <w:basedOn w:val="TableNormal"/>
+    <w:uiPriority w:val="48"/>
+    <w:rsid w:val="00374E7D"/>
+    <w:pPr>
+      <w:spacing w:after="0" w:line="240" w:lineRule="auto"/>
+    </w:pPr>
+    <w:tblPr>
+      <w:tblStyleRowBandSize w:val="1"/>
+      <w:tblStyleColBandSize w:val="1"/>
+      <w:tblBorders>
+        <w:top w:val="single" w:sz="4" w:space="0" w:color="9CC2E5" w:themeColor="accent5" w:themeTint="99"/>
+        <w:left w:val="single" w:sz="4" w:space="0" w:color="9CC2E5" w:themeColor="accent5" w:themeTint="99"/>
+        <w:bottom w:val="single" w:sz="4" w:space="0" w:color="9CC2E5" w:themeColor="accent5" w:themeTint="99"/>
+        <w:right w:val="single" w:sz="4" w:space="0" w:color="9CC2E5" w:themeColor="accent5" w:themeTint="99"/>
+        <w:insideH w:val="single" w:sz="4" w:space="0" w:color="9CC2E5" w:themeColor="accent5" w:themeTint="99"/>
+        <w:insideV w:val="single" w:sz="4" w:space="0" w:color="9CC2E5" w:themeColor="accent5" w:themeTint="99"/>
+      </w:tblBorders>
+    </w:tblPr>
+    <w:tblStylePr w:type="firstRow">
+      <w:rPr>
+        <w:b/>
+        <w:bCs/>
+      </w:rPr>
+      <w:tblPr/>
+      <w:tcPr>
+        <w:tcBorders>
+          <w:top w:val="nil"/>
+          <w:left w:val="nil"/>
+          <w:right w:val="nil"/>
+          <w:insideH w:val="nil"/>
+          <w:insideV w:val="nil"/>
+        </w:tcBorders>
+        <w:shd w:val="clear" w:color="auto" w:fill="FFFFFF" w:themeFill="background1"/>
+      </w:tcPr>
+    </w:tblStylePr>
+    <w:tblStylePr w:type="lastRow">
+      <w:rPr>
+        <w:b/>
+        <w:bCs/>
+      </w:rPr>
+      <w:tblPr/>
+      <w:tcPr>
+        <w:tcBorders>
+          <w:left w:val="nil"/>
+          <w:bottom w:val="nil"/>
+          <w:right w:val="nil"/>
+          <w:insideH w:val="nil"/>
+          <w:insideV w:val="nil"/>
+        </w:tcBorders>
+        <w:shd w:val="clear" w:color="auto" w:fill="FFFFFF" w:themeFill="background1"/>
+      </w:tcPr>
+    </w:tblStylePr>
+    <w:tblStylePr w:type="firstCol">
+      <w:pPr>
+        <w:jc w:val="right"/>
+      </w:pPr>
+      <w:rPr>
+        <w:i/>
+        <w:iCs/>
+      </w:rPr>
+      <w:tblPr/>
+      <w:tcPr>
+        <w:tcBorders>
+          <w:top w:val="nil"/>
+          <w:left w:val="nil"/>
+          <w:bottom w:val="nil"/>
+          <w:insideH w:val="nil"/>
+          <w:insideV w:val="nil"/>
+        </w:tcBorders>
+        <w:shd w:val="clear" w:color="auto" w:fill="FFFFFF" w:themeFill="background1"/>
+      </w:tcPr>
+    </w:tblStylePr>
+    <w:tblStylePr w:type="lastCol">
+      <w:rPr>
+        <w:i/>
+        <w:iCs/>
+      </w:rPr>
+      <w:tblPr/>
+      <w:tcPr>
+        <w:tcBorders>
+          <w:top w:val="nil"/>
+          <w:bottom w:val="nil"/>
+          <w:right w:val="nil"/>
+          <w:insideH w:val="nil"/>
+          <w:insideV w:val="nil"/>
+        </w:tcBorders>
+        <w:shd w:val="clear" w:color="auto" w:fill="FFFFFF" w:themeFill="background1"/>
+      </w:tcPr>
+    </w:tblStylePr>
+    <w:tblStylePr w:type="band1Vert">
+      <w:tblPr/>
+      <w:tcPr>
+        <w:shd w:val="clear" w:color="auto" w:fill="DEEAF6" w:themeFill="accent5" w:themeFillTint="33"/>
+      </w:tcPr>
+    </w:tblStylePr>
+    <w:tblStylePr w:type="band1Horz">
+      <w:tblPr/>
+      <w:tcPr>
+        <w:shd w:val="clear" w:color="auto" w:fill="DEEAF6" w:themeFill="accent5" w:themeFillTint="33"/>
+      </w:tcPr>
+    </w:tblStylePr>
+    <w:tblStylePr w:type="neCell">
+      <w:tblPr/>
+      <w:tcPr>
+        <w:tcBorders>
+          <w:bottom w:val="single" w:sz="4" w:space="0" w:color="9CC2E5" w:themeColor="accent5" w:themeTint="99"/>
+        </w:tcBorders>
+      </w:tcPr>
+    </w:tblStylePr>
+    <w:tblStylePr w:type="nwCell">
+      <w:tblPr/>
+      <w:tcPr>
+        <w:tcBorders>
+          <w:bottom w:val="single" w:sz="4" w:space="0" w:color="9CC2E5" w:themeColor="accent5" w:themeTint="99"/>
+        </w:tcBorders>
+      </w:tcPr>
+    </w:tblStylePr>
+    <w:tblStylePr w:type="seCell">
+      <w:tblPr/>
+      <w:tcPr>
+        <w:tcBorders>
+          <w:top w:val="single" w:sz="4" w:space="0" w:color="9CC2E5" w:themeColor="accent5" w:themeTint="99"/>
+        </w:tcBorders>
+      </w:tcPr>
+    </w:tblStylePr>
+    <w:tblStylePr w:type="swCell">
+      <w:tblPr/>
+      <w:tcPr>
+        <w:tcBorders>
+          <w:top w:val="single" w:sz="4" w:space="0" w:color="9CC2E5" w:themeColor="accent5" w:themeTint="99"/>
+        </w:tcBorders>
+      </w:tcPr>
+    </w:tblStylePr>
+  </w:style>
+  <w:style w:type="table" w:styleId="GridTable2-Accent5">
+    <w:name w:val="Grid Table 2 Accent 5"/>
+    <w:basedOn w:val="TableNormal"/>
+    <w:uiPriority w:val="47"/>
+    <w:rsid w:val="00374E7D"/>
+    <w:pPr>
+      <w:spacing w:after="0" w:line="240" w:lineRule="auto"/>
+    </w:pPr>
+    <w:tblPr>
+      <w:tblStyleRowBandSize w:val="1"/>
+      <w:tblStyleColBandSize w:val="1"/>
+      <w:tblBorders>
+        <w:top w:val="single" w:sz="2" w:space="0" w:color="9CC2E5" w:themeColor="accent5" w:themeTint="99"/>
+        <w:bottom w:val="single" w:sz="2" w:space="0" w:color="9CC2E5" w:themeColor="accent5" w:themeTint="99"/>
+        <w:insideH w:val="single" w:sz="2" w:space="0" w:color="9CC2E5" w:themeColor="accent5" w:themeTint="99"/>
+        <w:insideV w:val="single" w:sz="2" w:space="0" w:color="9CC2E5" w:themeColor="accent5" w:themeTint="99"/>
+      </w:tblBorders>
+    </w:tblPr>
+    <w:tblStylePr w:type="firstRow">
+      <w:rPr>
+        <w:b/>
+        <w:bCs/>
+      </w:rPr>
+      <w:tblPr/>
+      <w:tcPr>
+        <w:tcBorders>
+          <w:top w:val="nil"/>
+          <w:bottom w:val="single" w:sz="12" w:space="0" w:color="9CC2E5" w:themeColor="accent5" w:themeTint="99"/>
+          <w:insideH w:val="nil"/>
+          <w:insideV w:val="nil"/>
+        </w:tcBorders>
+        <w:shd w:val="clear" w:color="auto" w:fill="FFFFFF" w:themeFill="background1"/>
+      </w:tcPr>
+    </w:tblStylePr>
+    <w:tblStylePr w:type="lastRow">
+      <w:rPr>
+        <w:b/>
+        <w:bCs/>
+      </w:rPr>
+      <w:tblPr/>
+      <w:tcPr>
+        <w:tcBorders>
+          <w:top w:val="double" w:sz="2" w:space="0" w:color="9CC2E5" w:themeColor="accent5" w:themeTint="99"/>
+          <w:bottom w:val="nil"/>
+          <w:insideH w:val="nil"/>
+          <w:insideV w:val="nil"/>
+        </w:tcBorders>
+        <w:shd w:val="clear" w:color="auto" w:fill="FFFFFF" w:themeFill="background1"/>
+      </w:tcPr>
+    </w:tblStylePr>
+    <w:tblStylePr w:type="firstCol">
+      <w:rPr>
+        <w:b/>
+        <w:bCs/>
+      </w:rPr>
+    </w:tblStylePr>
+    <w:tblStylePr w:type="lastCol">
+      <w:rPr>
+        <w:b/>
+        <w:bCs/>
+      </w:rPr>
+    </w:tblStylePr>
+    <w:tblStylePr w:type="band1Vert">
+      <w:tblPr/>
+      <w:tcPr>
+        <w:shd w:val="clear" w:color="auto" w:fill="DEEAF6" w:themeFill="accent5" w:themeFillTint="33"/>
+      </w:tcPr>
+    </w:tblStylePr>
+    <w:tblStylePr w:type="band1Horz">
+      <w:tblPr/>
+      <w:tcPr>
+        <w:shd w:val="clear" w:color="auto" w:fill="DEEAF6" w:themeFill="accent5" w:themeFillTint="33"/>
+      </w:tcPr>
+    </w:tblStylePr>
+  </w:style>
 </w:styles>
 </file>
 

</xml_diff>